<commit_message>
docs: agregar tabla unificada con todas las tablas de verdad al manual técnico
</commit_message>
<xml_diff>
--- a/docs/Manual_Tecnico_MedReminderAI.docx
+++ b/docs/Manual_Tecnico_MedReminderAI.docx
@@ -11278,7 +11278,1064 @@
           <ns0:color ns0:val="1E293B"/>
           <ns0:sz ns0:val="22"/>
         </ns0:rPr>
-        <ns0:t>2.2.7 Implementación de Referencia en Python del Motor Lógico Proposicional</ns0:t>
+        <ns0:t>2.2.7 Matriz Unificada y Consolidada de Todas las Tablas de Verdad</ns0:t>
+      </ns0:r>
+    </ns0:p>
+    <ns0:p>
+      <ns0:pPr>
+        <ns0:spacing ns0:line="276" ns0:lineRule="auto" ns0:before="0" ns0:after="100"/>
+        <ns0:jc ns0:val="both"/>
+      </ns0:pPr>
+      <ns0:r>
+        <ns0:rPr>
+          <ns0:rFonts ns0:ascii="Calibri" ns0:hAnsi="Calibri"/>
+          <ns0:color ns0:val="1E293B"/>
+          <ns0:sz ns0:val="22"/>
+        </ns0:rPr>
+        <ns0:t>A continuación se presenta la tabla integral unificada que consolida las seis reglas deductivas del Motor Lógico Proposicional de MedReminder AI en una sola estructura analítica de referencia rápida para el equipo de desarrollo, mantenimiento y auditoría clínica. Esta matriz sintetiza las variables de entrada, su formulación proposicional exacta, las combinaciones booleanas de evaluación y la semántica transaccional resultante en el sistema:</ns0:t>
+      </ns0:r>
+    </ns0:p>
+    <ns0:p>
+      <ns0:pPr>
+        <ns0:keepNext/>
+        <ns0:spacing ns0:before="200" ns0:after="60"/>
+      </ns0:pPr>
+      <ns0:r>
+        <ns0:rPr>
+          <ns0:rFonts ns0:ascii="Calibri" ns0:hAnsi="Calibri"/>
+          <ns0:b/>
+          <ns0:color ns0:val="1B365D"/>
+          <ns0:sz ns0:val="18"/>
+        </ns0:rPr>
+        <ns0:t>Tabla 2.8: Matriz Unificada y Consolidada de Todas las Tablas de Verdad de MedReminder AI</ns0:t>
+      </ns0:r>
+    </ns0:p>
+    <ns0:tbl>
+      <ns0:tblPr>
+        <ns0:jc ns0:val="center"/>
+        <ns0:tblLayout ns0:type="fixed"/>
+        <ns0:tblLook ns0:firstColumn="1" ns0:firstRow="1" ns0:lastColumn="0" ns0:lastRow="0" ns0:noHBand="0" ns0:noVBand="1" ns0:val="04A0"/>
+        <ns0:tblW ns0:w="9360" ns0:type="dxa"/>
+        <ns0:tblBorders>
+          <ns0:top ns0:val="single" ns0:sz="6" ns0:space="0" ns0:color="CBD5E1"/>
+          <ns0:bottom ns0:val="single" ns0:sz="6" ns0:space="0" ns0:color="CBD5E1"/>
+          <ns0:left ns0:val="single" ns0:sz="6" ns0:space="0" ns0:color="CBD5E1"/>
+          <ns0:right ns0:val="single" ns0:sz="6" ns0:space="0" ns0:color="CBD5E1"/>
+          <ns0:insideH ns0:val="single" ns0:sz="6" ns0:space="0" ns0:color="CBD5E1"/>
+          <ns0:insideV ns0:val="single" ns0:sz="6" ns0:space="0" ns0:color="CBD5E1"/>
+        </ns0:tblBorders>
+      </ns0:tblPr>
+      <ns0:tblGrid>
+        <ns0:gridCol ns0:w="1872"/>
+        <ns0:gridCol ns0:w="2016"/>
+        <ns0:gridCol ns0:w="2016"/>
+        <ns0:gridCol ns0:w="1584"/>
+        <ns0:gridCol ns0:w="1872"/>
+      </ns0:tblGrid>
+      <ns0:tr>
+        <ns0:trPr>
+          <ns0:cantSplit/>
+          <ns0:tblHeader/>
+        </ns0:trPr>
+        <ns0:tc>
+          <ns0:tcPr>
+            <ns0:tcW ns0:w="1872" ns0:type="dxa"/>
+            <ns0:shd ns0:fill="1B365D"/>
+            <ns0:tcMar>
+              <ns0:top ns0:w="90" ns0:type="dxa"/>
+              <ns0:bottom ns0:w="90" ns0:type="dxa"/>
+              <ns0:left ns0:w="110" ns0:type="dxa"/>
+              <ns0:right ns0:w="110" ns0:type="dxa"/>
+            </ns0:tcMar>
+          </ns0:tcPr>
+          <ns0:p>
+            <ns0:pPr>
+              <ns0:spacing ns0:before="0" ns0:after="0" ns0:line="240" ns0:lineRule="auto"/>
+              <ns0:jc ns0:val="center"/>
+            </ns0:pPr>
+            <ns0:r>
+              <ns0:rPr>
+                <ns0:rFonts ns0:ascii="Calibri" ns0:hAnsi="Calibri"/>
+                <ns0:b/>
+                <ns0:color ns0:val="FFFFFF"/>
+                <ns0:sz ns0:val="19"/>
+              </ns0:rPr>
+              <ns0:t>Regla / Dominio Clínico</ns0:t>
+            </ns0:r>
+          </ns0:p>
+        </ns0:tc>
+        <ns0:tc>
+          <ns0:tcPr>
+            <ns0:tcW ns0:w="2016" ns0:type="dxa"/>
+            <ns0:shd ns0:fill="1B365D"/>
+            <ns0:tcMar>
+              <ns0:top ns0:w="90" ns0:type="dxa"/>
+              <ns0:bottom ns0:w="90" ns0:type="dxa"/>
+              <ns0:left ns0:w="110" ns0:type="dxa"/>
+              <ns0:right ns0:w="110" ns0:type="dxa"/>
+            </ns0:tcMar>
+          </ns0:tcPr>
+          <ns0:p>
+            <ns0:pPr>
+              <ns0:spacing ns0:before="0" ns0:after="0" ns0:line="240" ns0:lineRule="auto"/>
+              <ns0:jc ns0:val="center"/>
+            </ns0:pPr>
+            <ns0:r>
+              <ns0:rPr>
+                <ns0:rFonts ns0:ascii="Calibri" ns0:hAnsi="Calibri"/>
+                <ns0:b/>
+                <ns0:color ns0:val="FFFFFF"/>
+                <ns0:sz ns0:val="19"/>
+              </ns0:rPr>
+              <ns0:t>Fórmula Proposicional Canónica</ns0:t>
+            </ns0:r>
+          </ns0:p>
+        </ns0:tc>
+        <ns0:tc>
+          <ns0:tcPr>
+            <ns0:tcW ns0:w="2016" ns0:type="dxa"/>
+            <ns0:shd ns0:fill="1B365D"/>
+            <ns0:tcMar>
+              <ns0:top ns0:w="90" ns0:type="dxa"/>
+              <ns0:bottom ns0:w="90" ns0:type="dxa"/>
+              <ns0:left ns0:w="110" ns0:type="dxa"/>
+              <ns0:right ns0:w="110" ns0:type="dxa"/>
+            </ns0:tcMar>
+          </ns0:tcPr>
+          <ns0:p>
+            <ns0:pPr>
+              <ns0:spacing ns0:before="0" ns0:after="0" ns0:line="240" ns0:lineRule="auto"/>
+              <ns0:jc ns0:val="center"/>
+            </ns0:pPr>
+            <ns0:r>
+              <ns0:rPr>
+                <ns0:rFonts ns0:ascii="Calibri" ns0:hAnsi="Calibri"/>
+                <ns0:b/>
+                <ns0:color ns0:val="FFFFFF"/>
+                <ns0:sz ns0:val="19"/>
+              </ns0:rPr>
+              <ns0:t>Variables de Entrada</ns0:t>
+            </ns0:r>
+          </ns0:p>
+        </ns0:tc>
+        <ns0:tc>
+          <ns0:tcPr>
+            <ns0:tcW ns0:w="1584" ns0:type="dxa"/>
+            <ns0:shd ns0:fill="1B365D"/>
+            <ns0:tcMar>
+              <ns0:top ns0:w="90" ns0:type="dxa"/>
+              <ns0:bottom ns0:w="90" ns0:type="dxa"/>
+              <ns0:left ns0:w="110" ns0:type="dxa"/>
+              <ns0:right ns0:w="110" ns0:type="dxa"/>
+            </ns0:tcMar>
+          </ns0:tcPr>
+          <ns0:p>
+            <ns0:pPr>
+              <ns0:spacing ns0:before="0" ns0:after="0" ns0:line="240" ns0:lineRule="auto"/>
+              <ns0:jc ns0:val="center"/>
+            </ns0:pPr>
+            <ns0:r>
+              <ns0:rPr>
+                <ns0:rFonts ns0:ascii="Calibri" ns0:hAnsi="Calibri"/>
+                <ns0:b/>
+                <ns0:color ns0:val="FFFFFF"/>
+                <ns0:sz ns0:val="19"/>
+              </ns0:rPr>
+              <ns0:t>Condición (V)</ns0:t>
+            </ns0:r>
+          </ns0:p>
+        </ns0:tc>
+        <ns0:tc>
+          <ns0:tcPr>
+            <ns0:tcW ns0:w="1872" ns0:type="dxa"/>
+            <ns0:shd ns0:fill="1B365D"/>
+            <ns0:tcMar>
+              <ns0:top ns0:w="90" ns0:type="dxa"/>
+              <ns0:bottom ns0:w="90" ns0:type="dxa"/>
+              <ns0:left ns0:w="110" ns0:type="dxa"/>
+              <ns0:right ns0:w="110" ns0:type="dxa"/>
+            </ns0:tcMar>
+          </ns0:tcPr>
+          <ns0:p>
+            <ns0:pPr>
+              <ns0:spacing ns0:before="0" ns0:after="0" ns0:line="240" ns0:lineRule="auto"/>
+              <ns0:jc ns0:val="center"/>
+            </ns0:pPr>
+            <ns0:r>
+              <ns0:rPr>
+                <ns0:rFonts ns0:ascii="Calibri" ns0:hAnsi="Calibri"/>
+                <ns0:b/>
+                <ns0:color ns0:val="FFFFFF"/>
+                <ns0:sz ns0:val="19"/>
+              </ns0:rPr>
+              <ns0:t>Resultado / Acción del Agente</ns0:t>
+            </ns0:r>
+          </ns0:p>
+        </ns0:tc>
+      </ns0:tr>
+      <ns0:tr>
+        <ns0:trPr>
+          <ns0:cantSplit/>
+        </ns0:trPr>
+        <ns0:tc>
+          <ns0:tcPr>
+            <ns0:tcW ns0:w="1872" ns0:type="dxa"/>
+            <ns0:tcMar>
+              <ns0:top ns0:w="70" ns0:type="dxa"/>
+              <ns0:bottom ns0:w="70" ns0:type="dxa"/>
+              <ns0:left ns0:w="100" ns0:type="dxa"/>
+              <ns0:right ns0:w="100" ns0:type="dxa"/>
+            </ns0:tcMar>
+            <ns0:shd ns0:fill="FFFFFF"/>
+          </ns0:tcPr>
+          <ns0:p>
+            <ns0:pPr>
+              <ns0:spacing ns0:before="0" ns0:after="0" ns0:line="240" ns0:lineRule="auto"/>
+              <ns0:jc ns0:val="left"/>
+            </ns0:pPr>
+            <ns0:r>
+              <ns0:rPr>
+                <ns0:rFonts ns0:ascii="Calibri" ns0:hAnsi="Calibri"/>
+                <ns0:color ns0:val="1E293B"/>
+                <ns0:sz ns0:val="19"/>
+              </ns0:rPr>
+              <ns0:t>2.2.1 Validación Alta de Fármacos</ns0:t>
+            </ns0:r>
+          </ns0:p>
+        </ns0:tc>
+        <ns0:tc>
+          <ns0:tcPr>
+            <ns0:tcW ns0:w="2016" ns0:type="dxa"/>
+            <ns0:tcMar>
+              <ns0:top ns0:w="70" ns0:type="dxa"/>
+              <ns0:bottom ns0:w="70" ns0:type="dxa"/>
+              <ns0:left ns0:w="100" ns0:type="dxa"/>
+              <ns0:right ns0:w="100" ns0:type="dxa"/>
+            </ns0:tcMar>
+            <ns0:shd ns0:fill="FFFFFF"/>
+          </ns0:tcPr>
+          <ns0:p>
+            <ns0:pPr>
+              <ns0:spacing ns0:before="0" ns0:after="0" ns0:line="240" ns0:lineRule="auto"/>
+              <ns0:jc ns0:val="left"/>
+            </ns0:pPr>
+            <ns0:r>
+              <ns0:rPr>
+                <ns0:rFonts ns0:ascii="Calibri" ns0:hAnsi="Calibri"/>
+                <ns0:color ns0:val="1E293B"/>
+                <ns0:sz ns0:val="19"/>
+              </ns0:rPr>
+              <ns0:t>V_alta = p ∧ q ∧ r ∧ s</ns0:t>
+              <ns0:br/>
+              <ns0:t>¬V = ¬p ∨ ¬q ∨ ¬r ∨ ¬s</ns0:t>
+            </ns0:r>
+          </ns0:p>
+        </ns0:tc>
+        <ns0:tc>
+          <ns0:tcPr>
+            <ns0:tcW ns0:w="2016" ns0:type="dxa"/>
+            <ns0:tcMar>
+              <ns0:top ns0:w="70" ns0:type="dxa"/>
+              <ns0:bottom ns0:w="70" ns0:type="dxa"/>
+              <ns0:left ns0:w="100" ns0:type="dxa"/>
+              <ns0:right ns0:w="100" ns0:type="dxa"/>
+            </ns0:tcMar>
+            <ns0:shd ns0:fill="FFFFFF"/>
+          </ns0:tcPr>
+          <ns0:p>
+            <ns0:pPr>
+              <ns0:spacing ns0:before="0" ns0:after="0" ns0:line="240" ns0:lineRule="auto"/>
+              <ns0:jc ns0:val="left"/>
+            </ns0:pPr>
+            <ns0:r>
+              <ns0:rPr>
+                <ns0:rFonts ns0:ascii="Calibri" ns0:hAnsi="Calibri"/>
+                <ns0:color ns0:val="1E293B"/>
+                <ns0:sz ns0:val="19"/>
+              </ns0:rPr>
+              <ns0:t>p: Nombre válido</ns0:t>
+              <ns0:br/>
+              <ns0:t>q: Dosis &gt; 0</ns0:t>
+              <ns0:br/>
+              <ns0:t>r: Frec. admisible</ns0:t>
+              <ns0:br/>
+              <ns0:t>s: Stock &gt;= 0</ns0:t>
+            </ns0:r>
+          </ns0:p>
+        </ns0:tc>
+        <ns0:tc>
+          <ns0:tcPr>
+            <ns0:tcW ns0:w="1584" ns0:type="dxa"/>
+            <ns0:tcMar>
+              <ns0:top ns0:w="70" ns0:type="dxa"/>
+              <ns0:bottom ns0:w="70" ns0:type="dxa"/>
+              <ns0:left ns0:w="100" ns0:type="dxa"/>
+              <ns0:right ns0:w="100" ns0:type="dxa"/>
+            </ns0:tcMar>
+            <ns0:shd ns0:fill="FFFFFF"/>
+          </ns0:tcPr>
+          <ns0:p>
+            <ns0:pPr>
+              <ns0:spacing ns0:before="0" ns0:after="0" ns0:line="240" ns0:lineRule="auto"/>
+              <ns0:jc ns0:val="left"/>
+            </ns0:pPr>
+            <ns0:r>
+              <ns0:rPr>
+                <ns0:rFonts ns0:ascii="Calibri" ns0:hAnsi="Calibri"/>
+                <ns0:color ns0:val="1E293B"/>
+                <ns0:sz ns0:val="19"/>
+              </ns0:rPr>
+              <ns0:t>p=V ∧ q=V ∧</ns0:t>
+              <ns0:br/>
+              <ns0:t>r=V ∧ s=V</ns0:t>
+            </ns0:r>
+          </ns0:p>
+        </ns0:tc>
+        <ns0:tc>
+          <ns0:tcPr>
+            <ns0:tcW ns0:w="1872" ns0:type="dxa"/>
+            <ns0:tcMar>
+              <ns0:top ns0:w="70" ns0:type="dxa"/>
+              <ns0:bottom ns0:w="70" ns0:type="dxa"/>
+              <ns0:left ns0:w="100" ns0:type="dxa"/>
+              <ns0:right ns0:w="100" ns0:type="dxa"/>
+            </ns0:tcMar>
+            <ns0:shd ns0:fill="FFFFFF"/>
+          </ns0:tcPr>
+          <ns0:p>
+            <ns0:pPr>
+              <ns0:spacing ns0:before="0" ns0:after="0" ns0:line="240" ns0:lineRule="auto"/>
+              <ns0:jc ns0:val="left"/>
+            </ns0:pPr>
+            <ns0:r>
+              <ns0:rPr>
+                <ns0:rFonts ns0:ascii="Calibri" ns0:hAnsi="Calibri"/>
+                <ns0:color ns0:val="1E293B"/>
+                <ns0:sz ns0:val="19"/>
+              </ns0:rPr>
+              <ns0:t>V: Registro aprobado y persistido en DB.</ns0:t>
+              <ns0:br/>
+              <ns0:t>F: Rechazo formal con código HTTP 422.</ns0:t>
+            </ns0:r>
+          </ns0:p>
+        </ns0:tc>
+      </ns0:tr>
+      <ns0:tr>
+        <ns0:trPr>
+          <ns0:cantSplit/>
+        </ns0:trPr>
+        <ns0:tc>
+          <ns0:tcPr>
+            <ns0:tcW ns0:w="1872" ns0:type="dxa"/>
+            <ns0:tcMar>
+              <ns0:top ns0:w="70" ns0:type="dxa"/>
+              <ns0:bottom ns0:w="70" ns0:type="dxa"/>
+              <ns0:left ns0:w="100" ns0:type="dxa"/>
+              <ns0:right ns0:w="100" ns0:type="dxa"/>
+            </ns0:tcMar>
+            <ns0:shd ns0:fill="F8FAFC"/>
+          </ns0:tcPr>
+          <ns0:p>
+            <ns0:pPr>
+              <ns0:spacing ns0:before="0" ns0:after="0" ns0:line="240" ns0:lineRule="auto"/>
+              <ns0:jc ns0:val="left"/>
+            </ns0:pPr>
+            <ns0:r>
+              <ns0:rPr>
+                <ns0:rFonts ns0:ascii="Calibri" ns0:hAnsi="Calibri"/>
+                <ns0:color ns0:val="1E293B"/>
+                <ns0:sz ns0:val="19"/>
+              </ns0:rPr>
+              <ns0:t>2.2.2 Alerta de Stock Crítico</ns0:t>
+            </ns0:r>
+          </ns0:p>
+        </ns0:tc>
+        <ns0:tc>
+          <ns0:tcPr>
+            <ns0:tcW ns0:w="2016" ns0:type="dxa"/>
+            <ns0:tcMar>
+              <ns0:top ns0:w="70" ns0:type="dxa"/>
+              <ns0:bottom ns0:w="70" ns0:type="dxa"/>
+              <ns0:left ns0:w="100" ns0:type="dxa"/>
+              <ns0:right ns0:w="100" ns0:type="dxa"/>
+            </ns0:tcMar>
+            <ns0:shd ns0:fill="F8FAFC"/>
+          </ns0:tcPr>
+          <ns0:p>
+            <ns0:pPr>
+              <ns0:spacing ns0:before="0" ns0:after="0" ns0:line="240" ns0:lineRule="auto"/>
+              <ns0:jc ns0:val="left"/>
+            </ns0:pPr>
+            <ns0:r>
+              <ns0:rPr>
+                <ns0:rFonts ns0:ascii="Calibri" ns0:hAnsi="Calibri"/>
+                <ns0:color ns0:val="1E293B"/>
+                <ns0:sz ns0:val="19"/>
+              </ns0:rPr>
+              <ns0:t>Alerta_Stock = A ∧ B</ns0:t>
+            </ns0:r>
+          </ns0:p>
+        </ns0:tc>
+        <ns0:tc>
+          <ns0:tcPr>
+            <ns0:tcW ns0:w="2016" ns0:type="dxa"/>
+            <ns0:tcMar>
+              <ns0:top ns0:w="70" ns0:type="dxa"/>
+              <ns0:bottom ns0:w="70" ns0:type="dxa"/>
+              <ns0:left ns0:w="100" ns0:type="dxa"/>
+              <ns0:right ns0:w="100" ns0:type="dxa"/>
+            </ns0:tcMar>
+            <ns0:shd ns0:fill="F8FAFC"/>
+          </ns0:tcPr>
+          <ns0:p>
+            <ns0:pPr>
+              <ns0:spacing ns0:before="0" ns0:after="0" ns0:line="240" ns0:lineRule="auto"/>
+              <ns0:jc ns0:val="left"/>
+            </ns0:pPr>
+            <ns0:r>
+              <ns0:rPr>
+                <ns0:rFonts ns0:ascii="Calibri" ns0:hAnsi="Calibri"/>
+                <ns0:color ns0:val="1E293B"/>
+                <ns0:sz ns0:val="19"/>
+              </ns0:rPr>
+              <ns0:t>A: Stock &lt;= Umbral</ns0:t>
+              <ns0:br/>
+              <ns0:t>B: Tratamiento activo</ns0:t>
+            </ns0:r>
+          </ns0:p>
+        </ns0:tc>
+        <ns0:tc>
+          <ns0:tcPr>
+            <ns0:tcW ns0:w="1584" ns0:type="dxa"/>
+            <ns0:tcMar>
+              <ns0:top ns0:w="70" ns0:type="dxa"/>
+              <ns0:bottom ns0:w="70" ns0:type="dxa"/>
+              <ns0:left ns0:w="100" ns0:type="dxa"/>
+              <ns0:right ns0:w="100" ns0:type="dxa"/>
+            </ns0:tcMar>
+            <ns0:shd ns0:fill="F8FAFC"/>
+          </ns0:tcPr>
+          <ns0:p>
+            <ns0:pPr>
+              <ns0:spacing ns0:before="0" ns0:after="0" ns0:line="240" ns0:lineRule="auto"/>
+              <ns0:jc ns0:val="left"/>
+            </ns0:pPr>
+            <ns0:r>
+              <ns0:rPr>
+                <ns0:rFonts ns0:ascii="Calibri" ns0:hAnsi="Calibri"/>
+                <ns0:color ns0:val="1E293B"/>
+                <ns0:sz ns0:val="19"/>
+              </ns0:rPr>
+              <ns0:t>A=V ∧ B=V</ns0:t>
+            </ns0:r>
+          </ns0:p>
+        </ns0:tc>
+        <ns0:tc>
+          <ns0:tcPr>
+            <ns0:tcW ns0:w="1872" ns0:type="dxa"/>
+            <ns0:tcMar>
+              <ns0:top ns0:w="70" ns0:type="dxa"/>
+              <ns0:bottom ns0:w="70" ns0:type="dxa"/>
+              <ns0:left ns0:w="100" ns0:type="dxa"/>
+              <ns0:right ns0:w="100" ns0:type="dxa"/>
+            </ns0:tcMar>
+            <ns0:shd ns0:fill="F8FAFC"/>
+          </ns0:tcPr>
+          <ns0:p>
+            <ns0:pPr>
+              <ns0:spacing ns0:before="0" ns0:after="0" ns0:line="240" ns0:lineRule="auto"/>
+              <ns0:jc ns0:val="left"/>
+            </ns0:pPr>
+            <ns0:r>
+              <ns0:rPr>
+                <ns0:rFonts ns0:ascii="Calibri" ns0:hAnsi="Calibri"/>
+                <ns0:color ns0:val="1E293B"/>
+                <ns0:sz ns0:val="19"/>
+              </ns0:rPr>
+              <ns0:t>V: Disparo de advertencia urgente en Mi Botiquín.</ns0:t>
+              <ns0:br/>
+              <ns0:t>F: Inventario suficiente o tratamiento concluido.</ns0:t>
+            </ns0:r>
+          </ns0:p>
+        </ns0:tc>
+      </ns0:tr>
+      <ns0:tr>
+        <ns0:trPr>
+          <ns0:cantSplit/>
+        </ns0:trPr>
+        <ns0:tc>
+          <ns0:tcPr>
+            <ns0:tcW ns0:w="1872" ns0:type="dxa"/>
+            <ns0:tcMar>
+              <ns0:top ns0:w="70" ns0:type="dxa"/>
+              <ns0:bottom ns0:w="70" ns0:type="dxa"/>
+              <ns0:left ns0:w="100" ns0:type="dxa"/>
+              <ns0:right ns0:w="100" ns0:type="dxa"/>
+            </ns0:tcMar>
+            <ns0:shd ns0:fill="FFFFFF"/>
+          </ns0:tcPr>
+          <ns0:p>
+            <ns0:pPr>
+              <ns0:spacing ns0:before="0" ns0:after="0" ns0:line="240" ns0:lineRule="auto"/>
+              <ns0:jc ns0:val="left"/>
+            </ns0:pPr>
+            <ns0:r>
+              <ns0:rPr>
+                <ns0:rFonts ns0:ascii="Calibri" ns0:hAnsi="Calibri"/>
+                <ns0:color ns0:val="1E293B"/>
+                <ns0:sz ns0:val="19"/>
+              </ns0:rPr>
+              <ns0:t>2.2.3 Exclusión Mutua en Tomas de Medicamentos</ns0:t>
+            </ns0:r>
+          </ns0:p>
+        </ns0:tc>
+        <ns0:tc>
+          <ns0:tcPr>
+            <ns0:tcW ns0:w="2016" ns0:type="dxa"/>
+            <ns0:tcMar>
+              <ns0:top ns0:w="70" ns0:type="dxa"/>
+              <ns0:bottom ns0:w="70" ns0:type="dxa"/>
+              <ns0:left ns0:w="100" ns0:type="dxa"/>
+              <ns0:right ns0:w="100" ns0:type="dxa"/>
+            </ns0:tcMar>
+            <ns0:shd ns0:fill="FFFFFF"/>
+          </ns0:tcPr>
+          <ns0:p>
+            <ns0:pPr>
+              <ns0:spacing ns0:before="0" ns0:after="0" ns0:line="240" ns0:lineRule="auto"/>
+              <ns0:jc ns0:val="left"/>
+            </ns0:pPr>
+            <ns0:r>
+              <ns0:rPr>
+                <ns0:rFonts ns0:ascii="Calibri" ns0:hAnsi="Calibri"/>
+                <ns0:color ns0:val="1E293B"/>
+                <ns0:sz ns0:val="19"/>
+              </ns0:rPr>
+              <ns0:t>Validez = (t ⊕ p ⊕ o) ∧</ns0:t>
+              <ns0:br/>
+              <ns0:t>¬(t∧p) ∧ ¬(t∧o) ∧ ¬(p∧o)</ns0:t>
+            </ns0:r>
+          </ns0:p>
+        </ns0:tc>
+        <ns0:tc>
+          <ns0:tcPr>
+            <ns0:tcW ns0:w="2016" ns0:type="dxa"/>
+            <ns0:tcMar>
+              <ns0:top ns0:w="70" ns0:type="dxa"/>
+              <ns0:bottom ns0:w="70" ns0:type="dxa"/>
+              <ns0:left ns0:w="100" ns0:type="dxa"/>
+              <ns0:right ns0:w="100" ns0:type="dxa"/>
+            </ns0:tcMar>
+            <ns0:shd ns0:fill="FFFFFF"/>
+          </ns0:tcPr>
+          <ns0:p>
+            <ns0:pPr>
+              <ns0:spacing ns0:before="0" ns0:after="0" ns0:line="240" ns0:lineRule="auto"/>
+              <ns0:jc ns0:val="left"/>
+            </ns0:pPr>
+            <ns0:r>
+              <ns0:rPr>
+                <ns0:rFonts ns0:ascii="Calibri" ns0:hAnsi="Calibri"/>
+                <ns0:color ns0:val="1E293B"/>
+                <ns0:sz ns0:val="19"/>
+              </ns0:rPr>
+              <ns0:t>t: Tomado nominal</ns0:t>
+              <ns0:br/>
+              <ns0:t>p: Pospuesto temporal</ns0:t>
+              <ns0:br/>
+              <ns0:t>o: Omitido formal</ns0:t>
+            </ns0:r>
+          </ns0:p>
+        </ns0:tc>
+        <ns0:tc>
+          <ns0:tcPr>
+            <ns0:tcW ns0:w="1584" ns0:type="dxa"/>
+            <ns0:tcMar>
+              <ns0:top ns0:w="70" ns0:type="dxa"/>
+              <ns0:bottom ns0:w="70" ns0:type="dxa"/>
+              <ns0:left ns0:w="100" ns0:type="dxa"/>
+              <ns0:right ns0:w="100" ns0:type="dxa"/>
+            </ns0:tcMar>
+            <ns0:shd ns0:fill="FFFFFF"/>
+          </ns0:tcPr>
+          <ns0:p>
+            <ns0:pPr>
+              <ns0:spacing ns0:before="0" ns0:after="0" ns0:line="240" ns0:lineRule="auto"/>
+              <ns0:jc ns0:val="left"/>
+            </ns0:pPr>
+            <ns0:r>
+              <ns0:rPr>
+                <ns0:rFonts ns0:ascii="Calibri" ns0:hAnsi="Calibri"/>
+                <ns0:color ns0:val="1E293B"/>
+                <ns0:sz ns0:val="19"/>
+              </ns0:rPr>
+              <ns0:t>Exactamente</ns0:t>
+              <ns0:br/>
+              <ns0:t>una en V</ns0:t>
+            </ns0:r>
+          </ns0:p>
+        </ns0:tc>
+        <ns0:tc>
+          <ns0:tcPr>
+            <ns0:tcW ns0:w="1872" ns0:type="dxa"/>
+            <ns0:tcMar>
+              <ns0:top ns0:w="70" ns0:type="dxa"/>
+              <ns0:bottom ns0:w="70" ns0:type="dxa"/>
+              <ns0:left ns0:w="100" ns0:type="dxa"/>
+              <ns0:right ns0:w="100" ns0:type="dxa"/>
+            </ns0:tcMar>
+            <ns0:shd ns0:fill="FFFFFF"/>
+          </ns0:tcPr>
+          <ns0:p>
+            <ns0:pPr>
+              <ns0:spacing ns0:before="0" ns0:after="0" ns0:line="240" ns0:lineRule="auto"/>
+              <ns0:jc ns0:val="left"/>
+            </ns0:pPr>
+            <ns0:r>
+              <ns0:rPr>
+                <ns0:rFonts ns0:ascii="Calibri" ns0:hAnsi="Calibri"/>
+                <ns0:color ns0:val="1E293B"/>
+                <ns0:sz ns0:val="19"/>
+              </ns0:rPr>
+              <ns0:t>V: Transacción válida registrada en historial_toma.</ns0:t>
+              <ns0:br/>
+              <ns0:t>F: Contradicción clínica / transacción denegada.</ns0:t>
+            </ns0:r>
+          </ns0:p>
+        </ns0:tc>
+      </ns0:tr>
+      <ns0:tr>
+        <ns0:trPr>
+          <ns0:cantSplit/>
+        </ns0:trPr>
+        <ns0:tc>
+          <ns0:tcPr>
+            <ns0:tcW ns0:w="1872" ns0:type="dxa"/>
+            <ns0:tcMar>
+              <ns0:top ns0:w="70" ns0:type="dxa"/>
+              <ns0:bottom ns0:w="70" ns0:type="dxa"/>
+              <ns0:left ns0:w="100" ns0:type="dxa"/>
+              <ns0:right ns0:w="100" ns0:type="dxa"/>
+            </ns0:tcMar>
+            <ns0:shd ns0:fill="F8FAFC"/>
+          </ns0:tcPr>
+          <ns0:p>
+            <ns0:pPr>
+              <ns0:spacing ns0:before="0" ns0:after="0" ns0:line="240" ns0:lineRule="auto"/>
+              <ns0:jc ns0:val="left"/>
+            </ns0:pPr>
+            <ns0:r>
+              <ns0:rPr>
+                <ns0:rFonts ns0:ascii="Calibri" ns0:hAnsi="Calibri"/>
+                <ns0:color ns0:val="1E293B"/>
+                <ns0:sz ns0:val="19"/>
+              </ns0:rPr>
+              <ns0:t>2.2.4 Límite de Posposiciones (k=2)</ns0:t>
+            </ns0:r>
+          </ns0:p>
+        </ns0:tc>
+        <ns0:tc>
+          <ns0:tcPr>
+            <ns0:tcW ns0:w="2016" ns0:type="dxa"/>
+            <ns0:tcMar>
+              <ns0:top ns0:w="70" ns0:type="dxa"/>
+              <ns0:bottom ns0:w="70" ns0:type="dxa"/>
+              <ns0:left ns0:w="100" ns0:type="dxa"/>
+              <ns0:right ns0:w="100" ns0:type="dxa"/>
+            </ns0:tcMar>
+            <ns0:shd ns0:fill="F8FAFC"/>
+          </ns0:tcPr>
+          <ns0:p>
+            <ns0:pPr>
+              <ns0:spacing ns0:before="0" ns0:after="0" ns0:line="240" ns0:lineRule="auto"/>
+              <ns0:jc ns0:val="left"/>
+            </ns0:pPr>
+            <ns0:r>
+              <ns0:rPr>
+                <ns0:rFonts ns0:ascii="Calibri" ns0:hAnsi="Calibri"/>
+                <ns0:color ns0:val="1E293B"/>
+                <ns0:sz ns0:val="19"/>
+              </ns0:rPr>
+              <ns0:t>Permitir_Posponer = C ∧ D</ns0:t>
+            </ns0:r>
+          </ns0:p>
+        </ns0:tc>
+        <ns0:tc>
+          <ns0:tcPr>
+            <ns0:tcW ns0:w="2016" ns0:type="dxa"/>
+            <ns0:tcMar>
+              <ns0:top ns0:w="70" ns0:type="dxa"/>
+              <ns0:bottom ns0:w="70" ns0:type="dxa"/>
+              <ns0:left ns0:w="100" ns0:type="dxa"/>
+              <ns0:right ns0:w="100" ns0:type="dxa"/>
+            </ns0:tcMar>
+            <ns0:shd ns0:fill="F8FAFC"/>
+          </ns0:tcPr>
+          <ns0:p>
+            <ns0:pPr>
+              <ns0:spacing ns0:before="0" ns0:after="0" ns0:line="240" ns0:lineRule="auto"/>
+              <ns0:jc ns0:val="left"/>
+            </ns0:pPr>
+            <ns0:r>
+              <ns0:rPr>
+                <ns0:rFonts ns0:ascii="Calibri" ns0:hAnsi="Calibri"/>
+                <ns0:color ns0:val="1E293B"/>
+                <ns0:sz ns0:val="19"/>
+              </ns0:rPr>
+              <ns0:t>C: Solicitud de aplazamiento</ns0:t>
+              <ns0:br/>
+              <ns0:t>D: Contador &lt; 2</ns0:t>
+            </ns0:r>
+          </ns0:p>
+        </ns0:tc>
+        <ns0:tc>
+          <ns0:tcPr>
+            <ns0:tcW ns0:w="1584" ns0:type="dxa"/>
+            <ns0:tcMar>
+              <ns0:top ns0:w="70" ns0:type="dxa"/>
+              <ns0:bottom ns0:w="70" ns0:type="dxa"/>
+              <ns0:left ns0:w="100" ns0:type="dxa"/>
+              <ns0:right ns0:w="100" ns0:type="dxa"/>
+            </ns0:tcMar>
+            <ns0:shd ns0:fill="F8FAFC"/>
+          </ns0:tcPr>
+          <ns0:p>
+            <ns0:pPr>
+              <ns0:spacing ns0:before="0" ns0:after="0" ns0:line="240" ns0:lineRule="auto"/>
+              <ns0:jc ns0:val="left"/>
+            </ns0:pPr>
+            <ns0:r>
+              <ns0:rPr>
+                <ns0:rFonts ns0:ascii="Calibri" ns0:hAnsi="Calibri"/>
+                <ns0:color ns0:val="1E293B"/>
+                <ns0:sz ns0:val="19"/>
+              </ns0:rPr>
+              <ns0:t>C=V ∧ D=V</ns0:t>
+            </ns0:r>
+          </ns0:p>
+        </ns0:tc>
+        <ns0:tc>
+          <ns0:tcPr>
+            <ns0:tcW ns0:w="1872" ns0:type="dxa"/>
+            <ns0:tcMar>
+              <ns0:top ns0:w="70" ns0:type="dxa"/>
+              <ns0:bottom ns0:w="70" ns0:type="dxa"/>
+              <ns0:left ns0:w="100" ns0:type="dxa"/>
+              <ns0:right ns0:w="100" ns0:type="dxa"/>
+            </ns0:tcMar>
+            <ns0:shd ns0:fill="F8FAFC"/>
+          </ns0:tcPr>
+          <ns0:p>
+            <ns0:pPr>
+              <ns0:spacing ns0:before="0" ns0:after="0" ns0:line="240" ns0:lineRule="auto"/>
+              <ns0:jc ns0:val="left"/>
+            </ns0:pPr>
+            <ns0:r>
+              <ns0:rPr>
+                <ns0:rFonts ns0:ascii="Calibri" ns0:hAnsi="Calibri"/>
+                <ns0:color ns0:val="1E293B"/>
+                <ns0:sz ns0:val="19"/>
+              </ns0:rPr>
+              <ns0:t>V: Reprogramación determinista de alarma +30 min.</ns0:t>
+              <ns0:br/>
+              <ns0:t>F: Bloqueo de botón; forzar tomas de medicamentos u omisión de dosis.</ns0:t>
+            </ns0:r>
+          </ns0:p>
+        </ns0:tc>
+      </ns0:tr>
+      <ns0:tr>
+        <ns0:trPr>
+          <ns0:cantSplit/>
+        </ns0:trPr>
+        <ns0:tc>
+          <ns0:tcPr>
+            <ns0:tcW ns0:w="1872" ns0:type="dxa"/>
+            <ns0:tcMar>
+              <ns0:top ns0:w="70" ns0:type="dxa"/>
+              <ns0:bottom ns0:w="70" ns0:type="dxa"/>
+              <ns0:left ns0:w="100" ns0:type="dxa"/>
+              <ns0:right ns0:w="100" ns0:type="dxa"/>
+            </ns0:tcMar>
+            <ns0:shd ns0:fill="FFFFFF"/>
+          </ns0:tcPr>
+          <ns0:p>
+            <ns0:pPr>
+              <ns0:spacing ns0:before="0" ns0:after="0" ns0:line="240" ns0:lineRule="auto"/>
+              <ns0:jc ns0:val="left"/>
+            </ns0:pPr>
+            <ns0:r>
+              <ns0:rPr>
+                <ns0:rFonts ns0:ascii="Calibri" ns0:hAnsi="Calibri"/>
+                <ns0:color ns0:val="1E293B"/>
+                <ns0:sz ns0:val="19"/>
+              </ns0:rPr>
+              <ns0:t>2.2.5 Bloqueo Alergias / Interacciones</ns0:t>
+            </ns0:r>
+          </ns0:p>
+        </ns0:tc>
+        <ns0:tc>
+          <ns0:tcPr>
+            <ns0:tcW ns0:w="2016" ns0:type="dxa"/>
+            <ns0:tcMar>
+              <ns0:top ns0:w="70" ns0:type="dxa"/>
+              <ns0:bottom ns0:w="70" ns0:type="dxa"/>
+              <ns0:left ns0:w="100" ns0:type="dxa"/>
+              <ns0:right ns0:w="100" ns0:type="dxa"/>
+            </ns0:tcMar>
+            <ns0:shd ns0:fill="FFFFFF"/>
+          </ns0:tcPr>
+          <ns0:p>
+            <ns0:pPr>
+              <ns0:spacing ns0:before="0" ns0:after="0" ns0:line="240" ns0:lineRule="auto"/>
+              <ns0:jc ns0:val="left"/>
+            </ns0:pPr>
+            <ns0:r>
+              <ns0:rPr>
+                <ns0:rFonts ns0:ascii="Calibri" ns0:hAnsi="Calibri"/>
+                <ns0:color ns0:val="1E293B"/>
+                <ns0:sz ns0:val="19"/>
+              </ns0:rPr>
+              <ns0:t>Bloqueo_Seguridad = X ∨ Y</ns0:t>
+            </ns0:r>
+          </ns0:p>
+        </ns0:tc>
+        <ns0:tc>
+          <ns0:tcPr>
+            <ns0:tcW ns0:w="2016" ns0:type="dxa"/>
+            <ns0:tcMar>
+              <ns0:top ns0:w="70" ns0:type="dxa"/>
+              <ns0:bottom ns0:w="70" ns0:type="dxa"/>
+              <ns0:left ns0:w="100" ns0:type="dxa"/>
+              <ns0:right ns0:w="100" ns0:type="dxa"/>
+            </ns0:tcMar>
+            <ns0:shd ns0:fill="FFFFFF"/>
+          </ns0:tcPr>
+          <ns0:p>
+            <ns0:pPr>
+              <ns0:spacing ns0:before="0" ns0:after="0" ns0:line="240" ns0:lineRule="auto"/>
+              <ns0:jc ns0:val="left"/>
+            </ns0:pPr>
+            <ns0:r>
+              <ns0:rPr>
+                <ns0:rFonts ns0:ascii="Calibri" ns0:hAnsi="Calibri"/>
+                <ns0:color ns0:val="1E293B"/>
+                <ns0:sz ns0:val="19"/>
+              </ns0:rPr>
+              <ns0:t>X: Alergia a principio activo</ns0:t>
+              <ns0:br/>
+              <ns0:t>Y: Interacción medicamentosa</ns0:t>
+            </ns0:r>
+          </ns0:p>
+        </ns0:tc>
+        <ns0:tc>
+          <ns0:tcPr>
+            <ns0:tcW ns0:w="1584" ns0:type="dxa"/>
+            <ns0:tcMar>
+              <ns0:top ns0:w="70" ns0:type="dxa"/>
+              <ns0:bottom ns0:w="70" ns0:type="dxa"/>
+              <ns0:left ns0:w="100" ns0:type="dxa"/>
+              <ns0:right ns0:w="100" ns0:type="dxa"/>
+            </ns0:tcMar>
+            <ns0:shd ns0:fill="FFFFFF"/>
+          </ns0:tcPr>
+          <ns0:p>
+            <ns0:pPr>
+              <ns0:spacing ns0:before="0" ns0:after="0" ns0:line="240" ns0:lineRule="auto"/>
+              <ns0:jc ns0:val="left"/>
+            </ns0:pPr>
+            <ns0:r>
+              <ns0:rPr>
+                <ns0:rFonts ns0:ascii="Calibri" ns0:hAnsi="Calibri"/>
+                <ns0:color ns0:val="1E293B"/>
+                <ns0:sz ns0:val="19"/>
+              </ns0:rPr>
+              <ns0:t>X=V ∨ Y=V</ns0:t>
+            </ns0:r>
+          </ns0:p>
+        </ns0:tc>
+        <ns0:tc>
+          <ns0:tcPr>
+            <ns0:tcW ns0:w="1872" ns0:type="dxa"/>
+            <ns0:tcMar>
+              <ns0:top ns0:w="70" ns0:type="dxa"/>
+              <ns0:bottom ns0:w="70" ns0:type="dxa"/>
+              <ns0:left ns0:w="100" ns0:type="dxa"/>
+              <ns0:right ns0:w="100" ns0:type="dxa"/>
+            </ns0:tcMar>
+            <ns0:shd ns0:fill="FFFFFF"/>
+          </ns0:tcPr>
+          <ns0:p>
+            <ns0:pPr>
+              <ns0:spacing ns0:before="0" ns0:after="0" ns0:line="240" ns0:lineRule="auto"/>
+              <ns0:jc ns0:val="left"/>
+            </ns0:pPr>
+            <ns0:r>
+              <ns0:rPr>
+                <ns0:rFonts ns0:ascii="Calibri" ns0:hAnsi="Calibri"/>
+                <ns0:color ns0:val="1E293B"/>
+                <ns0:sz ns0:val="19"/>
+              </ns0:rPr>
+              <ns0:t>V: Bloqueo crítico inmediato de prescripción médica.</ns0:t>
+              <ns0:br/>
+              <ns0:t>F: Prescripción validada y segura.</ns0:t>
+            </ns0:r>
+          </ns0:p>
+        </ns0:tc>
+      </ns0:tr>
+      <ns0:tr>
+        <ns0:trPr>
+          <ns0:cantSplit/>
+        </ns0:trPr>
+        <ns0:tc>
+          <ns0:tcPr>
+            <ns0:tcW ns0:w="1872" ns0:type="dxa"/>
+            <ns0:tcMar>
+              <ns0:top ns0:w="70" ns0:type="dxa"/>
+              <ns0:bottom ns0:w="70" ns0:type="dxa"/>
+              <ns0:left ns0:w="100" ns0:type="dxa"/>
+              <ns0:right ns0:w="100" ns0:type="dxa"/>
+            </ns0:tcMar>
+            <ns0:shd ns0:fill="F8FAFC"/>
+          </ns0:tcPr>
+          <ns0:p>
+            <ns0:pPr>
+              <ns0:spacing ns0:before="0" ns0:after="0" ns0:line="240" ns0:lineRule="auto"/>
+              <ns0:jc ns0:val="left"/>
+            </ns0:pPr>
+            <ns0:r>
+              <ns0:rPr>
+                <ns0:rFonts ns0:ascii="Calibri" ns0:hAnsi="Calibri"/>
+                <ns0:color ns0:val="1E293B"/>
+                <ns0:sz ns0:val="19"/>
+              </ns0:rPr>
+              <ns0:t>2.2.6 Modo Castigo y Pérdida de Honor</ns0:t>
+            </ns0:r>
+          </ns0:p>
+        </ns0:tc>
+        <ns0:tc>
+          <ns0:tcPr>
+            <ns0:tcW ns0:w="2016" ns0:type="dxa"/>
+            <ns0:tcMar>
+              <ns0:top ns0:w="70" ns0:type="dxa"/>
+              <ns0:bottom ns0:w="70" ns0:type="dxa"/>
+              <ns0:left ns0:w="100" ns0:type="dxa"/>
+              <ns0:right ns0:w="100" ns0:type="dxa"/>
+            </ns0:tcMar>
+            <ns0:shd ns0:fill="F8FAFC"/>
+          </ns0:tcPr>
+          <ns0:p>
+            <ns0:pPr>
+              <ns0:spacing ns0:before="0" ns0:after="0" ns0:line="240" ns0:lineRule="auto"/>
+              <ns0:jc ns0:val="left"/>
+            </ns0:pPr>
+            <ns0:r>
+              <ns0:rPr>
+                <ns0:rFonts ns0:ascii="Calibri" ns0:hAnsi="Calibri"/>
+                <ns0:color ns0:val="1E293B"/>
+                <ns0:sz ns0:val="19"/>
+              </ns0:rPr>
+              <ns0:t>Modo_Castigo = M ∧ N</ns0:t>
+            </ns0:r>
+          </ns0:p>
+        </ns0:tc>
+        <ns0:tc>
+          <ns0:tcPr>
+            <ns0:tcW ns0:w="2016" ns0:type="dxa"/>
+            <ns0:tcMar>
+              <ns0:top ns0:w="70" ns0:type="dxa"/>
+              <ns0:bottom ns0:w="70" ns0:type="dxa"/>
+              <ns0:left ns0:w="100" ns0:type="dxa"/>
+              <ns0:right ns0:w="100" ns0:type="dxa"/>
+            </ns0:tcMar>
+            <ns0:shd ns0:fill="F8FAFC"/>
+          </ns0:tcPr>
+          <ns0:p>
+            <ns0:pPr>
+              <ns0:spacing ns0:before="0" ns0:after="0" ns0:line="240" ns0:lineRule="auto"/>
+              <ns0:jc ns0:val="left"/>
+            </ns0:pPr>
+            <ns0:r>
+              <ns0:rPr>
+                <ns0:rFonts ns0:ascii="Calibri" ns0:hAnsi="Calibri"/>
+                <ns0:color ns0:val="1E293B"/>
+                <ns0:sz ns0:val="19"/>
+              </ns0:rPr>
+              <ns0:t>M: Omisiones &gt;= 2 (72 h)</ns0:t>
+              <ns0:br/>
+              <ns0:t>N: Escudos == 0</ns0:t>
+            </ns0:r>
+          </ns0:p>
+        </ns0:tc>
+        <ns0:tc>
+          <ns0:tcPr>
+            <ns0:tcW ns0:w="1584" ns0:type="dxa"/>
+            <ns0:tcMar>
+              <ns0:top ns0:w="70" ns0:type="dxa"/>
+              <ns0:bottom ns0:w="70" ns0:type="dxa"/>
+              <ns0:left ns0:w="100" ns0:type="dxa"/>
+              <ns0:right ns0:w="100" ns0:type="dxa"/>
+            </ns0:tcMar>
+            <ns0:shd ns0:fill="F8FAFC"/>
+          </ns0:tcPr>
+          <ns0:p>
+            <ns0:pPr>
+              <ns0:spacing ns0:before="0" ns0:after="0" ns0:line="240" ns0:lineRule="auto"/>
+              <ns0:jc ns0:val="left"/>
+            </ns0:pPr>
+            <ns0:r>
+              <ns0:rPr>
+                <ns0:rFonts ns0:ascii="Calibri" ns0:hAnsi="Calibri"/>
+                <ns0:color ns0:val="1E293B"/>
+                <ns0:sz ns0:val="19"/>
+              </ns0:rPr>
+              <ns0:t>M=V ∧ N=V</ns0:t>
+            </ns0:r>
+          </ns0:p>
+        </ns0:tc>
+        <ns0:tc>
+          <ns0:tcPr>
+            <ns0:tcW ns0:w="1872" ns0:type="dxa"/>
+            <ns0:tcMar>
+              <ns0:top ns0:w="70" ns0:type="dxa"/>
+              <ns0:bottom ns0:w="70" ns0:type="dxa"/>
+              <ns0:left ns0:w="100" ns0:type="dxa"/>
+              <ns0:right ns0:w="100" ns0:type="dxa"/>
+            </ns0:tcMar>
+            <ns0:shd ns0:fill="F8FAFC"/>
+          </ns0:tcPr>
+          <ns0:p>
+            <ns0:pPr>
+              <ns0:spacing ns0:before="0" ns0:after="0" ns0:line="240" ns0:lineRule="auto"/>
+              <ns0:jc ns0:val="left"/>
+            </ns0:pPr>
+            <ns0:r>
+              <ns0:rPr>
+                <ns0:rFonts ns0:ascii="Calibri" ns0:hAnsi="Calibri"/>
+                <ns0:color ns0:val="1E293B"/>
+                <ns0:sz ns0:val="19"/>
+              </ns0:rPr>
+              <ns0:t>V: Activación Modo Castigo: bloqueo posposición.</ns0:t>
+              <ns0:br/>
+              <ns0:t>F: Consumo de escudo o modo normal preservado.</ns0:t>
+            </ns0:r>
+          </ns0:p>
+        </ns0:tc>
+      </ns0:tr>
+    </ns0:tbl>
+    <ns0:p>
+      <ns0:pPr>
+        <ns0:pStyle ns0:val="Ttulo3"/>
+        <ns0:keepNext/>
+        <ns0:spacing ns0:before="160" ns0:after="40"/>
+      </ns0:pPr>
+      <ns0:r>
+        <ns0:rPr>
+          <ns0:rFonts ns0:ascii="Calibri" ns0:hAnsi="Calibri"/>
+          <ns0:b/>
+          <ns0:color ns0:val="1E293B"/>
+          <ns0:sz ns0:val="22"/>
+        </ns0:rPr>
+        <ns0:t>2.2.8 Implementación de Referencia en Python del Motor Lógico Proposicional</ns0:t>
       </ns0:r>
     </ns0:p>
     <ns0:p>
@@ -11467,7 +12524,7 @@
           <ns0:color ns0:val="1B365D"/>
           <ns0:sz ns0:val="18"/>
         </ns0:rPr>
-        <ns0:t>Tabla 2.8: Matriz Canónica de Requisitos Funcionales (RF-01 a RF-12)</ns0:t>
+        <ns0:t>Tabla 2.9: Matriz Canónica de Requisitos Funcionales (RF-01 a RF-12)</ns0:t>
       </ns0:r>
     </ns0:p>
     <ns0:tbl>
@@ -13296,7 +14353,7 @@
           <ns0:color ns0:val="1B365D"/>
           <ns0:sz ns0:val="18"/>
         </ns0:rPr>
-        <ns0:t>Tabla 2.9: Matriz Formal de Requisitos No Funcionales (RNF-01 a RNF-08)</ns0:t>
+        <ns0:t>Tabla 2.10: Matriz Formal de Requisitos No Funcionales (RNF-01 a RNF-08)</ns0:t>
       </ns0:r>
     </ns0:p>
     <ns0:tbl>

</xml_diff>